<commit_message>
docs: v2.0 — 9 règles d'alerte, capteur porte, perte de comm
Mise à jour des documents Word et PDF :
- Section alertes : 6 → 9 règles (sensor_fault, door_open, comm_loss)
- Matériel : ajout capteur de porte (reed switch, ~5$)
- Total kit : ~100-135$ CAD
- Version archivée dans docs/versions/

Versionnement des documents :
- docs/versions/EHM_Guide_Projet_v1.0.docx/pdf (archive)
- docs/versions/CHANGELOG.md (historique des versions)
- docs/EHM_Guide_Projet.docx/pdf (version courante v2.0)

Co-Authored-By: Claude Opus 4.6 (1M context) <noreply@anthropic.com>
</commit_message>
<xml_diff>
--- a/docs/EHM_Guide_Projet.docx
+++ b/docs/EHM_Guide_Projet.docx
@@ -42,7 +42,7 @@
           <w:color w:val="787878"/>
           <w:sz w:val="22"/>
         </w:rPr>
-        <w:t>v1.0 — Mai 2026</w:t>
+        <w:t>v2.0 — Mai 2026</w:t>
       </w:r>
     </w:p>
     <w:p>
@@ -110,7 +110,7 @@
         <w:rPr>
           <w:sz w:val="22"/>
         </w:rPr>
-        <w:t>5. Les 6 règles d'alerte</w:t>
+        <w:t>5. Les 9 règles d'alerte</w:t>
       </w:r>
     </w:p>
     <w:p>
@@ -313,6 +313,14 @@
         <w:pStyle w:val="ListBullet"/>
       </w:pPr>
       <w:r>
+        <w:t>Ouverture de porte du panneau (optionnel)</w:t>
+      </w:r>
+    </w:p>
+    <w:p>
+      <w:pPr>
+        <w:pStyle w:val="ListBullet"/>
+      </w:pPr>
+      <w:r>
         <w:t>Tension sur les phases (optionnel, phase 2)</w:t>
       </w:r>
     </w:p>
@@ -339,7 +347,7 @@
         <w:pStyle w:val="ListBullet"/>
       </w:pPr>
       <w:r>
-        <w:t>Analyse chaque mesure en temps réel</w:t>
+        <w:t>Analyse chaque mesure en temps réel (9 règles d'alerte)</w:t>
       </w:r>
     </w:p>
     <w:p>
@@ -347,7 +355,15 @@
         <w:pStyle w:val="ListBullet"/>
       </w:pPr>
       <w:r>
-        <w:t>Déclenche des alertes selon 6 règles configurables</w:t>
+        <w:t>Détecte les capteurs défectueux (CT débranché, sonde cassée)</w:t>
+      </w:r>
+    </w:p>
+    <w:p>
+      <w:pPr>
+        <w:pStyle w:val="ListBullet"/>
+      </w:pPr>
+      <w:r>
+        <w:t>Alerte en cas de perte de communication avec un équipement</w:t>
       </w:r>
     </w:p>
     <w:p>
@@ -459,7 +475,7 @@
         <w:pStyle w:val="Heading1"/>
       </w:pPr>
       <w:r>
-        <w:t>Les 6 règles d'alerte</w:t>
+        <w:t>Les 9 règles d'alerte</w:t>
       </w:r>
     </w:p>
     <w:p>
@@ -469,6 +485,16 @@
           <w:sz w:val="22"/>
         </w:rPr>
         <w:t>Chaque règle a un seuil configurable par équipement :</w:t>
+      </w:r>
+    </w:p>
+    <w:p/>
+    <w:p>
+      <w:r>
+        <w:rPr>
+          <w:b/>
+          <w:sz w:val="22"/>
+        </w:rPr>
+        <w:t>RÈGLES DE BASE (6) :</w:t>
       </w:r>
     </w:p>
     <w:p/>
@@ -535,6 +561,74 @@
     <w:p>
       <w:r>
         <w:t xml:space="preserve">   → Problème d'alimentation en amont</w:t>
+      </w:r>
+    </w:p>
+    <w:p/>
+    <w:p>
+      <w:r>
+        <w:rPr>
+          <w:b/>
+          <w:sz w:val="22"/>
+        </w:rPr>
+        <w:t>NOUVELLES RÈGLES (3) :</w:t>
+      </w:r>
+    </w:p>
+    <w:p/>
+    <w:p>
+      <w:r>
+        <w:t>7. CAPTEUR DÉFECTUEUX — CT débranché ou sonde température cassée</w:t>
+      </w:r>
+    </w:p>
+    <w:p>
+      <w:r>
+        <w:t xml:space="preserve">   → CT : courant = 0 A sur une phase alors que les autres sont actives</w:t>
+      </w:r>
+    </w:p>
+    <w:p>
+      <w:r>
+        <w:t xml:space="preserve">   → Sonde : lecture aberrante &lt; -20°C ou &gt; 150°C (DS18B20 défaillant)</w:t>
+      </w:r>
+    </w:p>
+    <w:p>
+      <w:r>
+        <w:t xml:space="preserve">   → Alerte distincte par capteur (ex: sensor_fault_ct_b, sensor_fault_temp_2)</w:t>
+      </w:r>
+    </w:p>
+    <w:p/>
+    <w:p>
+      <w:r>
+        <w:t>8. OUVERTURE DE PORTE — Porte du panneau électrique ouverte</w:t>
+      </w:r>
+    </w:p>
+    <w:p>
+      <w:r>
+        <w:t xml:space="preserve">   → Détecte ouverture non autorisée, intervention ou vandalisme</w:t>
+      </w:r>
+    </w:p>
+    <w:p>
+      <w:r>
+        <w:t xml:space="preserve">   → Nécessite un capteur magnétique à ~5$ (optionnel)</w:t>
+      </w:r>
+    </w:p>
+    <w:p/>
+    <w:p>
+      <w:r>
+        <w:t>9. PERTE DE COMMUNICATION — Aucune donnée reçue depuis X secondes</w:t>
+      </w:r>
+    </w:p>
+    <w:p>
+      <w:r>
+        <w:t xml:space="preserve">   → Surveille le moniteur lui-même, pas seulement l'équipement</w:t>
+      </w:r>
+    </w:p>
+    <w:p>
+      <w:r>
+        <w:t xml:space="preserve">   → Seuil configurable par équipement (défaut : 60 secondes)</w:t>
+      </w:r>
+    </w:p>
+    <w:p>
+      <w:r>
+        <w:t xml:space="preserve">   → Se résout automatiquement quand la communication reprend</w:t>
       </w:r>
     </w:p>
     <w:p>
@@ -1180,6 +1274,58 @@
           </w:p>
         </w:tc>
       </w:tr>
+      <w:tr>
+        <w:tc>
+          <w:tcPr>
+            <w:tcW w:type="dxa" w:w="1728"/>
+          </w:tcPr>
+          <w:p>
+            <w:r>
+              <w:t>Capteur porte</w:t>
+            </w:r>
+          </w:p>
+        </w:tc>
+        <w:tc>
+          <w:tcPr>
+            <w:tcW w:type="dxa" w:w="1728"/>
+          </w:tcPr>
+          <w:p>
+            <w:r>
+              <w:t>Reed switch magn.</w:t>
+            </w:r>
+          </w:p>
+        </w:tc>
+        <w:tc>
+          <w:tcPr>
+            <w:tcW w:type="dxa" w:w="1728"/>
+          </w:tcPr>
+          <w:p>
+            <w:r>
+              <w:t>1</w:t>
+            </w:r>
+          </w:p>
+        </w:tc>
+        <w:tc>
+          <w:tcPr>
+            <w:tcW w:type="dxa" w:w="1728"/>
+          </w:tcPr>
+          <w:p>
+            <w:r>
+              <w:t>~5 $</w:t>
+            </w:r>
+          </w:p>
+        </w:tc>
+        <w:tc>
+          <w:tcPr>
+            <w:tcW w:type="dxa" w:w="1728"/>
+          </w:tcPr>
+          <w:p>
+            <w:r>
+              <w:t>Amazon.ca</w:t>
+            </w:r>
+          </w:p>
+        </w:tc>
+      </w:tr>
     </w:tbl>
     <w:p/>
     <w:p>
@@ -1187,7 +1333,7 @@
         <w:rPr>
           <w:b/>
         </w:rPr>
-        <w:t>TOTAL PAR PANNEAU : ~100 à 130 $ CAD</w:t>
+        <w:t>TOTAL PAR PANNEAU : ~100 à 135 $ CAD</w:t>
       </w:r>
     </w:p>
     <w:p>

</xml_diff>